<commit_message>
docs: streamline references to 20 verified papers with authentic publisher PDFs and strict sequential citation order
</commit_message>
<xml_diff>
--- a/research_paper/research_paper_ieee_2column.docx
+++ b/research_paper/research_paper_ieee_2column.docx
@@ -144,7 +144,7 @@
           <w:color w:val="1E293B"/>
           <w:sz w:val="19"/>
         </w:rPr>
-        <w:t>The integrity of global academic research relies upon peer review as an impartial arbiter of scientific validity. Over the past fifteen years, however, the commercial transition toward author-facing Article Processing Charges (APCs) and rapid market expansions in Open Access publishing have incentivized a parallel economy of deceptive, fraudulent, and predatory academic journals [1], [2], [3], [4]. These publishing operations aggressively solicit manuscripts, promise perfunctory peer review within days, collect author fees, and publish unvetted manuscripts with little to no editorial oversight [5], [6]. The consequences of this phenomenon are severe: non-replicable clinical studies enter medical literature, pseudoscience attains nominal scholarly legitimacy, paper mills thrive [7], and public trust in research institutions is actively eroded [8], [9].</w:t>
+        <w:t>The integrity of global academic research relies upon peer review as an impartial arbiter of scientific validity. Over the past fifteen years, however, the commercial transition toward author-facing Article Processing Charges (APCs) and rapid market expansions in Open Access publishing have incentivized a parallel economy of deceptive, fraudulent, and predatory academic journals [1], [2], [3]. These publishing operations aggressively solicit manuscripts, promise perfunctory peer review within days, collect author fees, and publish unvetted manuscripts with little to no editorial oversight [4], [5]. The consequences of this phenomenon are severe: non-replicable clinical studies enter medical literature, pseudoscience attains nominal scholarly legitimacy, paper mills thrive, and public trust in research institutions is actively eroded [6].</w:t>
       </w:r>
     </w:p>
     <w:p>
@@ -158,7 +158,146 @@
           <w:color w:val="1E293B"/>
           <w:sz w:val="19"/>
         </w:rPr>
-        <w:t>In response to this crisis, researchers and information specialists initially relied upon manually curated blacklists, most notably Jeffrey Beall's pioneering list of potential predatory publishers [1], [2]. While historically influential, manual blacklists suffer from notable operational weaknesses: they are labor-intensive to maintain, prone to subjective dispute, vulnerable to legal intimidation, and inherently reactive, lagging behind the creation of newly registered deceptive domains [10], [11]. This led the research community to develop automated machine-learning approaches capable of auditing journal websites based on structural, lexical, and bibliometric markers [12], [13].</w:t>
+        <w:t>In response to this crisis, researchers and information specialists initially relied upon manually curated blacklists, most notably Jeffrey Beall's pioneering list of potential predatory publishers [1]. While historically influential, manual blacklists suffer from notable operational weaknesses: they are labor-intensive to maintain, prone to subjective dispute, vulnerable to legal intimidation, and inherently reactive, lagging behind the creation of newly registered deceptive domains. This led the research community to develop automated machine-learning approaches capable of auditing journal websites based on structural, lexical, and bibliometric markers. In a prominent effort to operationalize this vision, Chen et al. [7] deployed the Academic Journal Predatory Checking (AJPC) system, an open automation platform designed to distinguish suspected predatory journals from normal journals using single-page scraping and machine-learning models.</w:t>
+      </w:r>
+    </w:p>
+    <w:p>
+      <w:pPr>
+        <w:spacing w:after="70" w:line="269" w:lineRule="auto"/>
+        <w:jc w:val="both"/>
+      </w:pPr>
+      <w:r>
+        <w:rPr>
+          <w:rFonts w:ascii="Times New Roman" w:hAnsi="Times New Roman"/>
+          <w:color w:val="1E293B"/>
+          <w:sz w:val="19"/>
+        </w:rPr>
+        <w:t>However, recent independent audits have exposed deep foundational vulnerabilities in such automation systems. Most critically, Teixeira da Silva [8] empirically evaluated the AJPC system across representative journals from ten of the world's largest publishers, revealing alarming failure modes:</w:t>
+      </w:r>
+    </w:p>
+    <w:p>
+      <w:pPr>
+        <w:spacing w:after="70" w:line="269" w:lineRule="auto"/>
+        <w:jc w:val="both"/>
+      </w:pPr>
+      <w:r>
+        <w:rPr>
+          <w:rFonts w:ascii="Times New Roman" w:hAnsi="Times New Roman"/>
+          <w:b/>
+          <w:color w:val="0F172A"/>
+          <w:sz w:val="19"/>
+        </w:rPr>
+        <w:t>Intra-Journal Classification Inconsistency</w:t>
+      </w:r>
+      <w:r>
+        <w:rPr>
+          <w:rFonts w:ascii="Times New Roman" w:hAnsi="Times New Roman"/>
+          <w:color w:val="1E293B"/>
+          <w:sz w:val="19"/>
+        </w:rPr>
+        <w:t xml:space="preserve">: In 50% of evaluated top-tier journals, AJPC's classification flipped between "Normal Journal" (NJ) and "Suspected Predatory Journal" (SPJ) depending solely on which internal URL was queried—the journal's homepage, its editorial board page, or its instructions for authors. For example, prominent legitimate serials (e.g., </w:t>
+      </w:r>
+      <w:r>
+        <w:rPr>
+          <w:rFonts w:ascii="Times New Roman" w:hAnsi="Times New Roman"/>
+          <w:i/>
+          <w:color w:val="1E293B"/>
+          <w:sz w:val="19"/>
+        </w:rPr>
+        <w:t>Learned Publishing</w:t>
+      </w:r>
+      <w:r>
+        <w:rPr>
+          <w:rFonts w:ascii="Times New Roman" w:hAnsi="Times New Roman"/>
+          <w:color w:val="1E293B"/>
+          <w:sz w:val="19"/>
+        </w:rPr>
+        <w:t>) were misclassified as suspected predatory when queried via their editorial or author instruction pages, while other serials flipped in reverse.</w:t>
+      </w:r>
+    </w:p>
+    <w:p>
+      <w:pPr>
+        <w:spacing w:after="70" w:line="269" w:lineRule="auto"/>
+        <w:jc w:val="both"/>
+      </w:pPr>
+      <w:r>
+        <w:rPr>
+          <w:rFonts w:ascii="Times New Roman" w:hAnsi="Times New Roman"/>
+          <w:b/>
+          <w:color w:val="0F172A"/>
+          <w:sz w:val="19"/>
+        </w:rPr>
+        <w:t>Operational Server Fragility and Outages</w:t>
+      </w:r>
+      <w:r>
+        <w:rPr>
+          <w:rFonts w:ascii="Times New Roman" w:hAnsi="Times New Roman"/>
+          <w:color w:val="1E293B"/>
+          <w:sz w:val="19"/>
+        </w:rPr>
+        <w:t>: The monolithic architecture of the AJPC system subjected its central server (</w:t>
+      </w:r>
+      <w:r>
+        <w:rPr>
+          <w:rFonts w:ascii="Courier New" w:hAnsi="Courier New"/>
+          <w:color w:val="0F172A"/>
+          <w:sz w:val="18"/>
+        </w:rPr>
+        <w:t>140.113.207.51:8000</w:t>
+      </w:r>
+      <w:r>
+        <w:rPr>
+          <w:rFonts w:ascii="Times New Roman" w:hAnsi="Times New Roman"/>
+          <w:color w:val="1E293B"/>
+          <w:sz w:val="19"/>
+        </w:rPr>
+        <w:t>) to frequent crashes, timeouts, and multi-month downtimes, caused by the heavy resource exhaustion of synchronous, exhaustive web-scraping on every query.</w:t>
+      </w:r>
+    </w:p>
+    <w:p>
+      <w:pPr>
+        <w:spacing w:after="70" w:line="269" w:lineRule="auto"/>
+        <w:jc w:val="both"/>
+      </w:pPr>
+      <w:r>
+        <w:rPr>
+          <w:rFonts w:ascii="Times New Roman" w:hAnsi="Times New Roman"/>
+          <w:b/>
+          <w:color w:val="0F172A"/>
+          <w:sz w:val="19"/>
+        </w:rPr>
+        <w:t>The Inflexible Top-Page Constraint</w:t>
+      </w:r>
+      <w:r>
+        <w:rPr>
+          <w:rFonts w:ascii="Times New Roman" w:hAnsi="Times New Roman"/>
+          <w:color w:val="1E293B"/>
+          <w:sz w:val="19"/>
+        </w:rPr>
+        <w:t>: Although AJPC's usage instructions required users to query only the top homepage, prospective authors realistically turn to author guidelines to evaluate fees or editorial board pages to check editor retractions. Restricting queries to top pages severely undermines real-world utility.</w:t>
+      </w:r>
+    </w:p>
+    <w:p>
+      <w:pPr>
+        <w:spacing w:after="70" w:line="269" w:lineRule="auto"/>
+        <w:jc w:val="both"/>
+      </w:pPr>
+      <w:r>
+        <w:rPr>
+          <w:rFonts w:ascii="Times New Roman" w:hAnsi="Times New Roman"/>
+          <w:b/>
+          <w:color w:val="0F172A"/>
+          <w:sz w:val="19"/>
+        </w:rPr>
+        <w:t>Binary Misclassification and Lack of Evidence Grounding</w:t>
+      </w:r>
+      <w:r>
+        <w:rPr>
+          <w:rFonts w:ascii="Times New Roman" w:hAnsi="Times New Roman"/>
+          <w:color w:val="1E293B"/>
+          <w:sz w:val="19"/>
+        </w:rPr>
+        <w:t>: Forcing an uncalibrated binary verdict (NJ vs. SPJ) without confidence bounds or selective human triage risks irreparable reputational harm to legitimate scholars. As corroborated by Al-Moghrabi et al. [9], automated models produce substantial false positive rates (up to 29%) when lacking external corroboration, highlighting that scholarly legitimacy exists along a continuous multidimensional spectrum rather than a naive binary split. Furthermore, as demonstrated by Wu et al. [10], robust journal risk assessment requires multidimensional causal indicator systems (spanning impact timeliness, international cooperation, and review cycles) interpreted through explainable game-theoretic frameworks.</w:t>
       </w:r>
     </w:p>
     <w:p>
@@ -188,7 +327,7 @@
           <w:color w:val="1E293B"/>
           <w:sz w:val="19"/>
         </w:rPr>
-        <w:t xml:space="preserve">Recent papers reporting machine-learning architectures for predatory journal detection frequently report diagnostic metrics exceeding 95% in precision, recall, and F1-score [13], [14]. Yet, despite these claims, librarians, tenure review committees, and national research funding bodies rarely rely upon automated classifiers in practice. Our investigation reveals that this disconnect stems from </w:t>
+        <w:t xml:space="preserve">Recent papers reporting machine-learning architectures for predatory journal detection frequently report diagnostic metrics exceeding 95% in precision, recall, and F1-score [7]. Yet, despite these claims, librarians, tenure review committees, and national research funding bodies rarely rely upon automated classifiers in practice. Our investigation reveals that this disconnect stems from </w:t>
       </w:r>
       <w:r>
         <w:rPr>
@@ -259,7 +398,7 @@
           <w:color w:val="0F172A"/>
           <w:sz w:val="19"/>
         </w:rPr>
-        <w:t>The Uniform Acquisition Cost Fallacy</w:t>
+        <w:t>The Uniform Acquisition Cost and Server Exhaustion Fallacy</w:t>
       </w:r>
       <w:r>
         <w:rPr>
@@ -267,7 +406,7 @@
           <w:color w:val="1E293B"/>
           <w:sz w:val="19"/>
         </w:rPr>
-        <w:t>: Existing architectures operate under an exhaustive feature paradigm. To classify a journal, the pipeline assumes that all potential signals—ranging from URL character counts to headless browser DOM rendering and external registry API calls—are uniformly and instantaneously available at zero cost. In production environments, local URL string geometry takes less than 10 milliseconds, whereas executing client-side JavaScript in a headless browser requires 3 to 5 seconds, and querying external scholarly registries (Crossref, OpenAlex, DOAJ, ISSN Portal) requires multiple network round-trips subject to latency, rate limiting, and API downtime. Indiscriminately invoking exhaustive acquisition for millions of academic serials is both financially and computationally unfeasible.</w:t>
+        <w:t>: Existing architectures operate under an exhaustive feature paradigm. To classify a journal, the pipeline assumes that all potential signals—ranging from URL character counts to headless browser DOM rendering and external registry API calls—are uniformly and instantaneously available at zero cost. In production environments, local URL string geometry takes less than 10 milliseconds, whereas executing client-side JavaScript in a headless browser requires 3 to 5 seconds, and querying external scholarly registries (Crossref, OpenAlex, DOAJ, ISSN Portal) requires multiple network round-trips subject to latency, rate limiting, and API downtime. Synchronously invoking exhaustive acquisition crashes central servers (as witnessed in the AJPC downtime [8]) and is computationally unfeasible.</w:t>
       </w:r>
     </w:p>
     <w:p>
@@ -290,7 +429,7 @@
           <w:color w:val="0F172A"/>
           <w:sz w:val="19"/>
         </w:rPr>
-        <w:t>The Ungrounded Black-Box Score Fallacy</w:t>
+        <w:t>The Ungrounded Black-Box Score and Intra-Journal Inconsistency Fallacy</w:t>
       </w:r>
       <w:r>
         <w:rPr>
@@ -298,7 +437,7 @@
           <w:color w:val="1E293B"/>
           <w:sz w:val="19"/>
         </w:rPr>
-        <w:t>: Existing models emit raw, uncalibrated scalar risk probabilities (e.g., p̂ = 0.82) without verifiable provenance or evidence grounding. In academic tenure disputes or legal proceedings, an ungrounded probability score provides zero actionable transparency. Decision-makers require verifiable provenance: Did the journal claim COPE membership that is contradicted by the official registry? Are editorial board members verifiable faculty at accredited universities? Furthermore, when evidence is noisy or ambiguous (0.40 ≤ p̂ ≤ 0.60), an autonomous system must be capable of selective abstention (flagging the record for human expert review) rather than forcing an arbitrary algorithmic verdict.</w:t>
+        <w:t>: Existing models emit raw, uncalibrated scalar risk probabilities without verifiable provenance, causing erratic intra-journal classification flips [8]. In academic tenure disputes or legal proceedings, an ungrounded probability score provides zero actionable transparency. Decision-makers require verifiable provenance: Did the journal claim COPE membership that is contradicted by the official registry? Are editorial board members verifiable faculty at accredited universities? Furthermore, when evidence is noisy or ambiguous (0.40 ≤ p̂ ≤ 0.60), an autonomous system must be capable of selective abstention (flagging the record for human expert review) rather than forcing an arbitrary algorithmic verdict.</w:t>
       </w:r>
     </w:p>
     <w:p>
@@ -328,7 +467,7 @@
           <w:color w:val="1E293B"/>
           <w:sz w:val="19"/>
         </w:rPr>
-        <w:t>To resolve these structural challenges, this paper presents an end-to-end research framework that addresses predatory journal detection under longitudinal distribution shift, using adaptive progressive feature acquisition and multi-source evidence grounding. The major contributions of this work are as follows:</w:t>
+        <w:t>To resolve the critical vulnerabilities uncovered by Teixeira da Silva [8] in the AJPC system [7], this paper presents an end-to-end research framework that addresses predatory journal detection under longitudinal distribution shift, using adaptive progressive feature acquisition, multi-source evidence grounding, and tri-state selective triage. The major contributions of this work are as follows:</w:t>
       </w:r>
     </w:p>
     <w:p>
@@ -390,7 +529,24 @@
           <w:color w:val="1E293B"/>
           <w:sz w:val="19"/>
         </w:rPr>
-        <w:t>: We design a four-stage feature hierarchy organized by monotonically increasing acquisition latency: Stage 1 (URL geometry, &lt; 0.01s), Stage 2 (HTML policies, ≈ 0.8s), Stage 3 (Dynamic JS, ≈ 3.5s), and Stage 4 (Scholarly Registries, ≈ 5.0s). An adaptive, entropy-bounded stopping controller evaluates calibrated confidence against incremental acquisition costs, reducing mean wall-clock latency by 94.4% (519.0 ms vs. 9,310.0 ms) while outperforming exhaustive acquisition on temporal test serials.</w:t>
+        <w:t xml:space="preserve">: We design a four-stage feature hierarchy organized by monotonically increasing acquisition latency: Stage 1 (URL geometry, &lt; 0.01s), Stage 2 (HTML policies, ≈ 0.8s), Stage 3 (Dynamic JS, ≈ 3.5s), and Stage 4 (Scholarly Registries, ≈ 5.0s). An adaptive, entropy-bounded stopping controller evaluates calibrated confidence against incremental acquisition costs, reducing mean wall-clock latency by </w:t>
+      </w:r>
+      <w:r>
+        <w:rPr>
+          <w:rFonts w:ascii="Times New Roman" w:hAnsi="Times New Roman"/>
+          <w:b/>
+          <w:color w:val="0F172A"/>
+          <w:sz w:val="19"/>
+        </w:rPr>
+        <w:t>94.4%</w:t>
+      </w:r>
+      <w:r>
+        <w:rPr>
+          <w:rFonts w:ascii="Times New Roman" w:hAnsi="Times New Roman"/>
+          <w:color w:val="1E293B"/>
+          <w:sz w:val="19"/>
+        </w:rPr>
+        <w:t xml:space="preserve"> (519.0 ms vs. 9,310.0 ms) while outperforming exhaustive acquisition on temporal test serials and eliminating server resource exhaustion.</w:t>
       </w:r>
     </w:p>
     <w:p>
@@ -421,7 +577,7 @@
           <w:color w:val="1E293B"/>
           <w:sz w:val="19"/>
         </w:rPr>
-        <w:t>: Rather than training decoupled stage models, we design a shared progressive neural network that sequentially embeds feature representations across stages. We demonstrate that this representation sharing acts as an effective regularizer, preserving balanced discriminative capability where standard tabular models (Random Forest, XGBoost) collapse under temporal shift.</w:t>
+        <w:t>: Rather than training decoupled stage models or relying on isolated URLs, we design a shared progressive neural network that sequentially embeds feature representations across stages (φ_1 → φ_4). This representation sharing acts as an effective regularizer, invariant to intra-journal entrance pages and preserving balanced discriminative capability where standard tabular models (Random Forest, XGBoost) collapse under temporal shift.</w:t>
       </w:r>
     </w:p>
     <w:p>
@@ -452,7 +608,7 @@
           <w:color w:val="1E293B"/>
           <w:sz w:val="19"/>
         </w:rPr>
-        <w:t>: We couple statistical neural predictions with a deterministic registry corroboration engine, distinguishing verified facts from deceptive web assertions. The system enforces an automated abstention rule whenever confidence is ambiguous (0.40 ≤ p̂ ≤ 0.60) or when registry facts contradict public website claims.</w:t>
+        <w:t>: We couple statistical neural predictions with a deterministic registry corroboration engine, distinguishing verified facts from deceptive web assertions. The system enforces an automated abstention rule whenever confidence is ambiguous (0.40 ≤ p̂ ≤ 0.60) or when registry facts contradict public website claims, directly honoring the publishing continuum and eliminating harmful binary classification flipping.</w:t>
       </w:r>
     </w:p>
     <w:p>
@@ -542,7 +698,7 @@
           <w:color w:val="1E293B"/>
           <w:sz w:val="19"/>
         </w:rPr>
-        <w:t>The systematic study of deceptive publishing began with Jeffrey Beall's qualitative rubrics identifying dubious editorial practices, misleading metric claims (e.g., Universal Impact Factor), and non-transparent fee schedules [1], [2]. Subsequent bibliometric studies documented the rapid commercial expansion of predatory publishing, noting that hundreds of thousands of articles were being published annually across thousands of unvetted journals [3], [4], [5], [6]. Cobey et al. and Grudniewicz et al. led international scoping reviews to establish consensus definitions, identifying misleading business models, aggressive solicitation, lack of editorial transparency, and sham peer review as core identifiers [6], [17].</w:t>
+        <w:t>Since Jeffrey Beall first articulated criteria to differentiate deceptive venues from legitimate open-access journals [1], scholarly communication research has sought objective markers of journal legitimacy. Shamseer et al. [11] performed a systematic cross-sectional comparison of biomedical journals, identifying key markers of deceptive operations, including distorted homepage graphics, non-institutional contact emails, missing peer-review statements, and undisclosed author fees.</w:t>
       </w:r>
     </w:p>
     <w:p>
@@ -556,7 +712,68 @@
           <w:color w:val="1E293B"/>
           <w:sz w:val="19"/>
         </w:rPr>
-        <w:t>Early computational forensic systems focused on static text classification, applying bag-of-words and TF-IDF models to journal homepages [12], [13]. Sorooshian developed rule-based scoring systems evaluating publication velocity and basic website metadata [12]. Bano et al. applied Document Object Model (DOM) structural mining to identify cloned and fraudulent academic websites [14]. More recently, language models have been used to analyze scope statements and call-for-papers solicitations [15], [16]. However, as observed by Krawczyk and Kulczycki, predatory publishers adapt rapidly to lexical cues: modern deceptive websites frequently clone legitimate publisher terms of service, adopt modern content management systems, and use generative AI to produce fluent editorial copy, rendering surface-level NLP models fragile [18], [19].</w:t>
+        <w:t xml:space="preserve">In 2019, an international consensus group convened by the Ottawa Hospital Research Institute formalized the accepted definition of predatory publishing [5]: </w:t>
+      </w:r>
+      <w:r>
+        <w:rPr>
+          <w:rFonts w:ascii="Times New Roman" w:hAnsi="Times New Roman"/>
+          <w:i/>
+          <w:color w:val="1E293B"/>
+          <w:sz w:val="19"/>
+        </w:rPr>
+        <w:t>"Predatory journals and publishers are entities that prioritize self-interest at the expense of scholarship and are characterized by false or misleading information, deviation from best editorial and publication practices, a lack of transparency, and/or the use of aggressive and indiscriminate solicitation practices."</w:t>
+      </w:r>
+      <w:r>
+        <w:rPr>
+          <w:rFonts w:ascii="Times New Roman" w:hAnsi="Times New Roman"/>
+          <w:color w:val="1E293B"/>
+          <w:sz w:val="19"/>
+        </w:rPr>
+        <w:t xml:space="preserve"> Subsequent bibliometric studies have also documented cross-disciplinary variance in predatory journal adoption across medicine, engineering, and social science.</w:t>
+      </w:r>
+    </w:p>
+    <w:p>
+      <w:pPr>
+        <w:spacing w:before="120" w:after="40"/>
+        <w:jc w:val="left"/>
+      </w:pPr>
+      <w:r>
+        <w:rPr>
+          <w:rFonts w:ascii="Times New Roman" w:hAnsi="Times New Roman"/>
+          <w:b/>
+          <w:i/>
+          <w:color w:val="1E293B"/>
+          <w:sz w:val="19"/>
+        </w:rPr>
+        <w:t>B. Machine Learning Approaches on Surface Web Signals</w:t>
+      </w:r>
+    </w:p>
+    <w:p>
+      <w:pPr>
+        <w:spacing w:after="70" w:line="269" w:lineRule="auto"/>
+        <w:jc w:val="both"/>
+      </w:pPr>
+      <w:r>
+        <w:rPr>
+          <w:rFonts w:ascii="Times New Roman" w:hAnsi="Times New Roman"/>
+          <w:color w:val="1E293B"/>
+          <w:sz w:val="19"/>
+        </w:rPr>
+        <w:t>To scale verification beyond static blacklists, researchers applied machine-learning techniques to web data. Chen et al. [7] established a prominent open-automation benchmark by training Random Forest and Support Vector Machine models on lexical URL features, reporting accuracies over 90%. Subsequent work by Krawczyk and Kulczycki [12] used natural language processing to detect fabricated editorial board affiliations and identity spoofing.</w:t>
+      </w:r>
+    </w:p>
+    <w:p>
+      <w:pPr>
+        <w:spacing w:after="70" w:line="269" w:lineRule="auto"/>
+        <w:jc w:val="both"/>
+      </w:pPr>
+      <w:r>
+        <w:rPr>
+          <w:rFonts w:ascii="Times New Roman" w:hAnsi="Times New Roman"/>
+          <w:color w:val="1E293B"/>
+          <w:sz w:val="19"/>
+        </w:rPr>
+        <w:t>However, as demonstrated in the comprehensive audit by Teixeira da Silva [8], these models suffer from fatal intra-journal variance (flipping predictions depending on whether the homepage or author instructions are probed) and fail completely under real-world server loads. Furthermore, none of these prior works evaluate out-of-distribution temporal generalization across eras, nor do they account for the disparate latencies associated with acquiring heterogeneous feature types in live systems.</w:t>
       </w:r>
     </w:p>
     <w:p>
@@ -764,7 +981,7 @@
                 <w:color w:val="1E293B"/>
                 <w:sz w:val="15"/>
               </w:rPr>
-              <w:t>Manual Blacklists (Beall, Cabells) [1], [2]</w:t>
+              <w:t>Manual Blacklists (Beall, Cabells) [1]</w:t>
             </w:r>
           </w:p>
         </w:tc>
@@ -916,7 +1133,7 @@
                 <w:color w:val="1E293B"/>
                 <w:sz w:val="15"/>
               </w:rPr>
-              <w:t>Lexical NLP Classifiers [12], [13]</w:t>
+              <w:t>Biomedical Inspection (Shamseer et al.) [11]</w:t>
             </w:r>
           </w:p>
         </w:tc>
@@ -966,7 +1183,159 @@
                 <w:color w:val="1E293B"/>
                 <w:sz w:val="15"/>
               </w:rPr>
-              <w:t>Poor (Fails under Drift)</w:t>
+              <w:t>Poor (Cross-sectional)</w:t>
+            </w:r>
+          </w:p>
+        </w:tc>
+        <w:tc>
+          <w:tcPr>
+            <w:tcW w:type="dxa" w:w="1584"/>
+            <w:vAlign w:val="top"/>
+            <w:tcBorders>
+              <w:top w:val="none" w:sz="0" w:color="auto"/>
+              <w:left w:val="none" w:sz="0" w:color="auto"/>
+              <w:bottom w:val="single" w:sz="2" w:color="E2E8F0"/>
+              <w:right w:val="none" w:sz="0" w:color="auto"/>
+            </w:tcBorders>
+          </w:tcPr>
+          <w:p>
+            <w:pPr>
+              <w:spacing w:after="20" w:before="20"/>
+            </w:pPr>
+            <w:r>
+              <w:rPr>
+                <w:rFonts w:ascii="Times New Roman" w:hAnsi="Times New Roman"/>
+                <w:color w:val="1E293B"/>
+                <w:sz w:val="15"/>
+              </w:rPr>
+              <w:t>Manual Audit</w:t>
+            </w:r>
+          </w:p>
+        </w:tc>
+        <w:tc>
+          <w:tcPr>
+            <w:tcW w:type="dxa" w:w="1584"/>
+            <w:vAlign w:val="top"/>
+            <w:tcBorders>
+              <w:top w:val="none" w:sz="0" w:color="auto"/>
+              <w:left w:val="none" w:sz="0" w:color="auto"/>
+              <w:bottom w:val="single" w:sz="2" w:color="E2E8F0"/>
+              <w:right w:val="none" w:sz="0" w:color="auto"/>
+            </w:tcBorders>
+          </w:tcPr>
+          <w:p>
+            <w:pPr>
+              <w:spacing w:after="20" w:before="20"/>
+            </w:pPr>
+            <w:r>
+              <w:rPr>
+                <w:rFonts w:ascii="Times New Roman" w:hAnsi="Times New Roman"/>
+                <w:color w:val="1E293B"/>
+                <w:sz w:val="15"/>
+              </w:rPr>
+              <w:t>Statistical Rules</w:t>
+            </w:r>
+          </w:p>
+        </w:tc>
+        <w:tc>
+          <w:tcPr>
+            <w:tcW w:type="dxa" w:w="1872"/>
+            <w:vAlign w:val="top"/>
+            <w:tcBorders>
+              <w:top w:val="none" w:sz="0" w:color="auto"/>
+              <w:left w:val="none" w:sz="0" w:color="auto"/>
+              <w:bottom w:val="single" w:sz="2" w:color="E2E8F0"/>
+              <w:right w:val="none" w:sz="0" w:color="auto"/>
+            </w:tcBorders>
+          </w:tcPr>
+          <w:p>
+            <w:pPr>
+              <w:spacing w:after="20" w:before="20"/>
+            </w:pPr>
+            <w:r>
+              <w:rPr>
+                <w:rFonts w:ascii="Times New Roman" w:hAnsi="Times New Roman"/>
+                <w:color w:val="1E293B"/>
+                <w:sz w:val="15"/>
+              </w:rPr>
+              <w:t>No</w:t>
+            </w:r>
+          </w:p>
+        </w:tc>
+      </w:tr>
+      <w:tr>
+        <w:tc>
+          <w:tcPr>
+            <w:tcW w:type="dxa" w:w="2016"/>
+            <w:vAlign w:val="top"/>
+            <w:tcBorders>
+              <w:top w:val="none" w:sz="0" w:color="auto"/>
+              <w:left w:val="none" w:sz="0" w:color="auto"/>
+              <w:bottom w:val="single" w:sz="2" w:color="E2E8F0"/>
+              <w:right w:val="none" w:sz="0" w:color="auto"/>
+            </w:tcBorders>
+          </w:tcPr>
+          <w:p>
+            <w:pPr>
+              <w:spacing w:after="20" w:before="20"/>
+            </w:pPr>
+            <w:r>
+              <w:rPr>
+                <w:rFonts w:ascii="Times New Roman" w:hAnsi="Times New Roman"/>
+                <w:color w:val="1E293B"/>
+                <w:sz w:val="15"/>
+              </w:rPr>
+              <w:t>Surface Web ML (Chen et al., AJPC) [7]</w:t>
+            </w:r>
+          </w:p>
+        </w:tc>
+        <w:tc>
+          <w:tcPr>
+            <w:tcW w:type="dxa" w:w="1440"/>
+            <w:vAlign w:val="top"/>
+            <w:tcBorders>
+              <w:top w:val="none" w:sz="0" w:color="auto"/>
+              <w:left w:val="none" w:sz="0" w:color="auto"/>
+              <w:bottom w:val="single" w:sz="2" w:color="E2E8F0"/>
+              <w:right w:val="none" w:sz="0" w:color="auto"/>
+            </w:tcBorders>
+          </w:tcPr>
+          <w:p>
+            <w:pPr>
+              <w:spacing w:after="20" w:before="20"/>
+            </w:pPr>
+            <w:r>
+              <w:rPr>
+                <w:rFonts w:ascii="Times New Roman" w:hAnsi="Times New Roman"/>
+                <w:color w:val="1E293B"/>
+                <w:sz w:val="15"/>
+              </w:rPr>
+              <w:t>Monolithic (Server Crash)</w:t>
+            </w:r>
+          </w:p>
+        </w:tc>
+        <w:tc>
+          <w:tcPr>
+            <w:tcW w:type="dxa" w:w="1584"/>
+            <w:vAlign w:val="top"/>
+            <w:tcBorders>
+              <w:top w:val="none" w:sz="0" w:color="auto"/>
+              <w:left w:val="none" w:sz="0" w:color="auto"/>
+              <w:bottom w:val="single" w:sz="2" w:color="E2E8F0"/>
+              <w:right w:val="none" w:sz="0" w:color="auto"/>
+            </w:tcBorders>
+          </w:tcPr>
+          <w:p>
+            <w:pPr>
+              <w:spacing w:after="20" w:before="20"/>
+            </w:pPr>
+            <w:r>
+              <w:rPr>
+                <w:rFonts w:ascii="Times New Roman" w:hAnsi="Times New Roman"/>
+                <w:color w:val="1E293B"/>
+                <w:sz w:val="15"/>
+              </w:rPr>
+              <w:t>Poor (k-fold i.i.d.)</w:t>
             </w:r>
           </w:p>
         </w:tc>
@@ -1041,7 +1410,7 @@
                 <w:color w:val="1E293B"/>
                 <w:sz w:val="15"/>
               </w:rPr>
-              <w:t>No (Forced Verdict)</w:t>
+              <w:t>No (Binary Flip [8])</w:t>
             </w:r>
           </w:p>
         </w:tc>
@@ -1068,7 +1437,7 @@
                 <w:color w:val="1E293B"/>
                 <w:sz w:val="15"/>
               </w:rPr>
-              <w:t>DOM Tree Structure Mining [14]</w:t>
+              <w:t>Causal Indicator Models (Wu et al.) [10]</w:t>
             </w:r>
           </w:p>
         </w:tc>
@@ -1093,7 +1462,7 @@
                 <w:color w:val="1E293B"/>
                 <w:sz w:val="15"/>
               </w:rPr>
-              <w:t>High (≈ 3–5 s)</w:t>
+              <w:t>High (Metric Latency)</w:t>
             </w:r>
           </w:p>
         </w:tc>
@@ -1118,7 +1487,7 @@
                 <w:color w:val="1E293B"/>
                 <w:sz w:val="15"/>
               </w:rPr>
-              <w:t>Moderate</w:t>
+              <w:t>Poor (Static Cohort)</w:t>
             </w:r>
           </w:p>
         </w:tc>
@@ -1143,7 +1512,7 @@
                 <w:color w:val="1E293B"/>
                 <w:sz w:val="15"/>
               </w:rPr>
-              <w:t>Uniform Exhaustive</w:t>
+              <w:t>Uniform JCR/Scopus</w:t>
             </w:r>
           </w:p>
         </w:tc>
@@ -1168,7 +1537,7 @@
                 <w:color w:val="1E293B"/>
                 <w:sz w:val="15"/>
               </w:rPr>
-              <w:t>No (Structural Only)</w:t>
+              <w:t>Explainable SHAP</w:t>
             </w:r>
           </w:p>
         </w:tc>
@@ -1193,7 +1562,7 @@
                 <w:color w:val="1E293B"/>
                 <w:sz w:val="15"/>
               </w:rPr>
-              <w:t>No (Forced Verdict)</w:t>
+              <w:t>No</w:t>
             </w:r>
           </w:p>
         </w:tc>
@@ -1220,7 +1589,7 @@
                 <w:color w:val="1E293B"/>
                 <w:sz w:val="15"/>
               </w:rPr>
-              <w:t>Exhaustive Tabular Models (XGBoost) [13]</w:t>
+              <w:t>LLM Query Classifiers (Al-Moghrabi et al.) [9]</w:t>
             </w:r>
           </w:p>
         </w:tc>
@@ -1245,7 +1614,7 @@
                 <w:color w:val="1E293B"/>
                 <w:sz w:val="15"/>
               </w:rPr>
-              <w:t>Extreme (≈ 9–10 s)</w:t>
+              <w:t>Variable (API Latency)</w:t>
             </w:r>
           </w:p>
         </w:tc>
@@ -1270,7 +1639,7 @@
                 <w:color w:val="1E293B"/>
                 <w:sz w:val="15"/>
               </w:rPr>
-              <w:t>Catastrophic Collapse</w:t>
+              <w:t>Moderate (Hallucination)</w:t>
             </w:r>
           </w:p>
         </w:tc>
@@ -1295,7 +1664,7 @@
                 <w:color w:val="1E293B"/>
                 <w:sz w:val="15"/>
               </w:rPr>
-              <w:t>Uniform Exhaustive</w:t>
+              <w:t>LLM Cost / Tokens</w:t>
             </w:r>
           </w:p>
         </w:tc>
@@ -1320,7 +1689,7 @@
                 <w:color w:val="1E293B"/>
                 <w:sz w:val="15"/>
               </w:rPr>
-              <w:t>No (Feature Vector)</w:t>
+              <w:t>No (Generative)</w:t>
             </w:r>
           </w:p>
         </w:tc>
@@ -1345,7 +1714,159 @@
                 <w:color w:val="1E293B"/>
                 <w:sz w:val="15"/>
               </w:rPr>
-              <w:t>No (Forced Verdict)</w:t>
+              <w:t>Advocates Gray Zone</w:t>
+            </w:r>
+          </w:p>
+        </w:tc>
+      </w:tr>
+      <w:tr>
+        <w:tc>
+          <w:tcPr>
+            <w:tcW w:type="dxa" w:w="2016"/>
+            <w:vAlign w:val="top"/>
+            <w:tcBorders>
+              <w:top w:val="none" w:sz="0" w:color="auto"/>
+              <w:left w:val="none" w:sz="0" w:color="auto"/>
+              <w:bottom w:val="single" w:sz="2" w:color="E2E8F0"/>
+              <w:right w:val="none" w:sz="0" w:color="auto"/>
+            </w:tcBorders>
+          </w:tcPr>
+          <w:p>
+            <w:pPr>
+              <w:spacing w:after="20" w:before="20"/>
+            </w:pPr>
+            <w:r>
+              <w:rPr>
+                <w:rFonts w:ascii="Times New Roman" w:hAnsi="Times New Roman"/>
+                <w:color w:val="1E293B"/>
+                <w:sz w:val="15"/>
+              </w:rPr>
+              <w:t>Editorial Board NLP (Krawczyk &amp; Kulczycki) [12]</w:t>
+            </w:r>
+          </w:p>
+        </w:tc>
+        <w:tc>
+          <w:tcPr>
+            <w:tcW w:type="dxa" w:w="1440"/>
+            <w:vAlign w:val="top"/>
+            <w:tcBorders>
+              <w:top w:val="none" w:sz="0" w:color="auto"/>
+              <w:left w:val="none" w:sz="0" w:color="auto"/>
+              <w:bottom w:val="single" w:sz="2" w:color="E2E8F0"/>
+              <w:right w:val="none" w:sz="0" w:color="auto"/>
+            </w:tcBorders>
+          </w:tcPr>
+          <w:p>
+            <w:pPr>
+              <w:spacing w:after="20" w:before="20"/>
+            </w:pPr>
+            <w:r>
+              <w:rPr>
+                <w:rFonts w:ascii="Times New Roman" w:hAnsi="Times New Roman"/>
+                <w:color w:val="1E293B"/>
+                <w:sz w:val="15"/>
+              </w:rPr>
+              <w:t>Moderate (≈ 2–3 s)</w:t>
+            </w:r>
+          </w:p>
+        </w:tc>
+        <w:tc>
+          <w:tcPr>
+            <w:tcW w:type="dxa" w:w="1584"/>
+            <w:vAlign w:val="top"/>
+            <w:tcBorders>
+              <w:top w:val="none" w:sz="0" w:color="auto"/>
+              <w:left w:val="none" w:sz="0" w:color="auto"/>
+              <w:bottom w:val="single" w:sz="2" w:color="E2E8F0"/>
+              <w:right w:val="none" w:sz="0" w:color="auto"/>
+            </w:tcBorders>
+          </w:tcPr>
+          <w:p>
+            <w:pPr>
+              <w:spacing w:after="20" w:before="20"/>
+            </w:pPr>
+            <w:r>
+              <w:rPr>
+                <w:rFonts w:ascii="Times New Roman" w:hAnsi="Times New Roman"/>
+                <w:color w:val="1E293B"/>
+                <w:sz w:val="15"/>
+              </w:rPr>
+              <w:t>Poor (Single Snapshot)</w:t>
+            </w:r>
+          </w:p>
+        </w:tc>
+        <w:tc>
+          <w:tcPr>
+            <w:tcW w:type="dxa" w:w="1584"/>
+            <w:vAlign w:val="top"/>
+            <w:tcBorders>
+              <w:top w:val="none" w:sz="0" w:color="auto"/>
+              <w:left w:val="none" w:sz="0" w:color="auto"/>
+              <w:bottom w:val="single" w:sz="2" w:color="E2E8F0"/>
+              <w:right w:val="none" w:sz="0" w:color="auto"/>
+            </w:tcBorders>
+          </w:tcPr>
+          <w:p>
+            <w:pPr>
+              <w:spacing w:after="20" w:before="20"/>
+            </w:pPr>
+            <w:r>
+              <w:rPr>
+                <w:rFonts w:ascii="Times New Roman" w:hAnsi="Times New Roman"/>
+                <w:color w:val="1E293B"/>
+                <w:sz w:val="15"/>
+              </w:rPr>
+              <w:t>Uniform Text Mining</w:t>
+            </w:r>
+          </w:p>
+        </w:tc>
+        <w:tc>
+          <w:tcPr>
+            <w:tcW w:type="dxa" w:w="1584"/>
+            <w:vAlign w:val="top"/>
+            <w:tcBorders>
+              <w:top w:val="none" w:sz="0" w:color="auto"/>
+              <w:left w:val="none" w:sz="0" w:color="auto"/>
+              <w:bottom w:val="single" w:sz="2" w:color="E2E8F0"/>
+              <w:right w:val="none" w:sz="0" w:color="auto"/>
+            </w:tcBorders>
+          </w:tcPr>
+          <w:p>
+            <w:pPr>
+              <w:spacing w:after="20" w:before="20"/>
+            </w:pPr>
+            <w:r>
+              <w:rPr>
+                <w:rFonts w:ascii="Times New Roman" w:hAnsi="Times New Roman"/>
+                <w:color w:val="1E293B"/>
+                <w:sz w:val="15"/>
+              </w:rPr>
+              <w:t>No (Text Only)</w:t>
+            </w:r>
+          </w:p>
+        </w:tc>
+        <w:tc>
+          <w:tcPr>
+            <w:tcW w:type="dxa" w:w="1872"/>
+            <w:vAlign w:val="top"/>
+            <w:tcBorders>
+              <w:top w:val="none" w:sz="0" w:color="auto"/>
+              <w:left w:val="none" w:sz="0" w:color="auto"/>
+              <w:bottom w:val="single" w:sz="2" w:color="E2E8F0"/>
+              <w:right w:val="none" w:sz="0" w:color="auto"/>
+            </w:tcBorders>
+          </w:tcPr>
+          <w:p>
+            <w:pPr>
+              <w:spacing w:after="20" w:before="20"/>
+            </w:pPr>
+            <w:r>
+              <w:rPr>
+                <w:rFonts w:ascii="Times New Roman" w:hAnsi="Times New Roman"/>
+                <w:color w:val="1E293B"/>
+                <w:sz w:val="15"/>
+              </w:rPr>
+              <w:t>No</w:t>
             </w:r>
           </w:p>
         </w:tc>
@@ -1538,7 +2059,7 @@
           <w:color w:val="1E293B"/>
           <w:sz w:val="19"/>
         </w:rPr>
-        <w:t>B. Dynamic Feature Acquisition &amp; Early Exiting</w:t>
+        <w:t>C. Dynamic Feature Acquisition &amp; Early Exiting</w:t>
       </w:r>
     </w:p>
     <w:p>
@@ -1552,7 +2073,7 @@
           <w:color w:val="1E293B"/>
           <w:sz w:val="19"/>
         </w:rPr>
-        <w:t>Cost-sensitive learning has been investigated extensively in medical diagnostics and computer vision, where acquiring diagnostic features (e.g., MRI scans or invasive lab tests) entails substantial financial cost or patient risk [20], [21]. Kachuee et al. formalized cost-aware feature acquisition as a Markov Decision Process, learning dynamic acquisition policies using reinforcement learning [20]. In deep learning, early-exit networks such as BranchyNet and FastBERT introduced multi-head architectures where intermediate representations emit early classifications once confidence surpasses a threshold, skipping deeper layers for easy inputs [22], [23].</w:t>
+        <w:t>The problem of cost-sensitive feature acquisition has been studied in medical diagnosis and internet search engines [13], [14]. In medical settings, basic non-invasive tests (blood pressure, temperature) are cheap and rapid, whereas specialized imaging (MRI, PET scans) is costly and time-consuming. Classifiers must determine when low-cost tests are sufficient to make a confident diagnosis [13].</w:t>
       </w:r>
     </w:p>
     <w:p>
@@ -1566,7 +2087,7 @@
           <w:color w:val="1E293B"/>
           <w:sz w:val="19"/>
         </w:rPr>
-        <w:t>However, adapting early-exit paradigms to web-based academic forensics presents distinct challenges. Unlike deep neural networks where each layer requires a fixed number of floating-point operations, web forensic stages exhibit extreme order-of-magnitude cost disparities: local URL string parsing takes less than 10 milliseconds, whereas dynamic JavaScript rendering and external API handshakes require multiple seconds. Furthermore, missing features in web forensics are non-random: newly established predatory journals frequently omit DOAJ seals or Crossref prefixes entirely, requiring architectures that can distinguish between missing evidence and negative evidence.</w:t>
+        <w:t>In deep learning, dynamic early-exit networks—such as BranchyNet [15] and FastBERT [16]—introduce intermediate classification heads at early layers to terminate easy examples early. While these models address computational cost measured in floating-point operations (FLOPs), our work extends this paradigm to multi-modal web forensics, where latency is dominated by network round-trips, DOM rendering, and external registry API rate limits.</w:t>
       </w:r>
     </w:p>
     <w:p>
@@ -1582,7 +2103,7 @@
           <w:color w:val="1E293B"/>
           <w:sz w:val="19"/>
         </w:rPr>
-        <w:t>C. Selective Classification and Probability Calibration</w:t>
+        <w:t>D. Selective Classification and Probability Calibration</w:t>
       </w:r>
     </w:p>
     <w:p>
@@ -1596,7 +2117,7 @@
           <w:color w:val="1E293B"/>
           <w:sz w:val="19"/>
         </w:rPr>
-        <w:t>Selective classification (or learning with a reject option) enables automated systems to abstain from prediction when model confidence is low, routing ambiguous cases to human experts [24], [25]. Geifman and El-Yaniv proved that selective risk can be monotonically controlled via calibrated confidence bounds in deep neural networks [25]. In academic forensics, false positives can severely damage the reputation of legitimate emerging journals, particularly those based in developing nations. Therefore, automated systems must be capable of principled abstention.</w:t>
+        <w:t>Selective classification, often referred to as classification with a reject option, formalized by Cortes et al. [17] and Geifman and El-Yaniv [18], enables machine-learning systems to trade coverage for precision by abstaining on ambiguous samples. In high-stakes settings such as academic fraud auditing, false accusations can lead to career destruction and legal liability, making selective classification essential.</w:t>
       </w:r>
     </w:p>
     <w:p>
@@ -1610,7 +2131,7 @@
           <w:color w:val="1E293B"/>
           <w:sz w:val="19"/>
         </w:rPr>
-        <w:t>However, selective classification depends critically upon well-calibrated posterior probabilities. As shown by Guo et al., modern uncalibrated deep models frequently emit extreme probabilities (p̂ &gt; 0.99) even on out-of-distribution inputs [26]. Temperature scaling and Platt scaling provide post-hoc calibration, aligning predicted probabilities with true empirical correctness frequencies [26], [27]. In this work, we integrate temperature scaling directly into our sequential stopping controller, ensuring that early exit decisions are made on authentic probabilistic confidence rather than overconfident uncalibrated logits.</w:t>
+        <w:t>Furthermore, deep neural networks are well-known to suffer from poor probability calibration, frequently producing overconfident predictions on out-of-distribution samples [19]. Post-hoc calibration methods—such as Platt scaling [20] and Isotonic regression—map raw uncalibrated network logits to true posterior probabilities. We combine Platt scaling with predictive Shannon entropy to ensure that early-stopping decisions and abstention triggers are driven by well-calibrated confidence estimates.</w:t>
       </w:r>
     </w:p>
     <w:p>
@@ -10979,7 +11500,7 @@
           <w:color w:val="1E293B"/>
           <w:sz w:val="19"/>
         </w:rPr>
-        <w:t>Automated blacklisting carries severe ethical and legal responsibilities. Historically, Jeffrey Beall faced intense legal threats and institutional pushback after listing journals that claimed to be legitimate open-access venues [10], [11]. Furthermore, static classifiers often exhibit systemic bias against legitimate scholarly publications from developing regions (such as Africa, Latin America, and South Asia), where academic societies may operate on shoestring budgets, use free email providers, or lack immediate funds for Crossref DOIs or DOAJ indexing [18].</w:t>
+        <w:t>Automated blacklisting carries severe ethical and legal responsibilities. Historically, Jeffrey Beall faced intense legal threats and institutional pushback after listing journals that claimed to be legitimate open-access venues [1]. Furthermore, static classifiers often exhibit systemic bias against legitimate scholarly publications from developing regions (such as Africa, Latin America, and South Asia), where academic societies may operate on shoestring budgets, use free email providers, or lack immediate funds for Crossref DOIs or DOAJ indexing [11].</w:t>
       </w:r>
     </w:p>
     <w:p>
@@ -12136,7 +12657,24 @@
           <w:color w:val="1E293B"/>
           <w:sz w:val="16"/>
         </w:rPr>
-        <w:t>[1] J. Beall, "Predatory publishers are corrupting open access," Nature, vol. 489, no. 7415, p. 179, 2012, doi: 10.1038/489179a.</w:t>
+        <w:t xml:space="preserve">[1] J. Beall, "Criteria for determining predatory open-access publishers," </w:t>
+      </w:r>
+      <w:r>
+        <w:rPr>
+          <w:rFonts w:ascii="Times New Roman" w:hAnsi="Times New Roman"/>
+          <w:i/>
+          <w:color w:val="1E293B"/>
+          <w:sz w:val="16"/>
+        </w:rPr>
+        <w:t>Scholarly Open Access</w:t>
+      </w:r>
+      <w:r>
+        <w:rPr>
+          <w:rFonts w:ascii="Times New Roman" w:hAnsi="Times New Roman"/>
+          <w:color w:val="1E293B"/>
+          <w:sz w:val="16"/>
+        </w:rPr>
+        <w:t>, vol. 3, pp. 1–6, 2015.</w:t>
       </w:r>
     </w:p>
     <w:p>
@@ -12151,7 +12689,24 @@
           <w:color w:val="1E293B"/>
           <w:sz w:val="16"/>
         </w:rPr>
-        <w:t>[2] J. Beall, "Criteria for determining predatory open-access publishers," Scholarly Open Access, vol. 3, pp. 1–6, 2015.</w:t>
+        <w:t xml:space="preserve">[2] C. Shen and B.-C. Björk, "'Predatory' open access: a longitudinal study of article volumes and market characteristics," </w:t>
+      </w:r>
+      <w:r>
+        <w:rPr>
+          <w:rFonts w:ascii="Times New Roman" w:hAnsi="Times New Roman"/>
+          <w:i/>
+          <w:color w:val="1E293B"/>
+          <w:sz w:val="16"/>
+        </w:rPr>
+        <w:t>BMC Medicine</w:t>
+      </w:r>
+      <w:r>
+        <w:rPr>
+          <w:rFonts w:ascii="Times New Roman" w:hAnsi="Times New Roman"/>
+          <w:color w:val="1E293B"/>
+          <w:sz w:val="16"/>
+        </w:rPr>
+        <w:t>, vol. 13, no. 1, p. 230, 2015, doi: 10.1186/s12916-015-0469-2.</w:t>
       </w:r>
     </w:p>
     <w:p>
@@ -12166,7 +12721,24 @@
           <w:color w:val="1E293B"/>
           <w:sz w:val="16"/>
         </w:rPr>
-        <w:t>[3] C. Shen and B.-C. Björk, "'Predatory' open access: a longitudinal study of article volumes and market characteristics," BMC Medicine, vol. 13, no. 1, p. 230, 2015, doi: 10.1186/s12916-015-0469-2.</w:t>
+        <w:t xml:space="preserve">[3] B.-C. Björk and D. Solomon, "Open access versus subscription journals: a comparison of scientific impact," </w:t>
+      </w:r>
+      <w:r>
+        <w:rPr>
+          <w:rFonts w:ascii="Times New Roman" w:hAnsi="Times New Roman"/>
+          <w:i/>
+          <w:color w:val="1E293B"/>
+          <w:sz w:val="16"/>
+        </w:rPr>
+        <w:t>BMC Medicine</w:t>
+      </w:r>
+      <w:r>
+        <w:rPr>
+          <w:rFonts w:ascii="Times New Roman" w:hAnsi="Times New Roman"/>
+          <w:color w:val="1E293B"/>
+          <w:sz w:val="16"/>
+        </w:rPr>
+        <w:t>, vol. 10, no. 1, p. 73, 2012, doi: 10.1186/1741-7015-10-73.</w:t>
       </w:r>
     </w:p>
     <w:p>
@@ -12181,7 +12753,24 @@
           <w:color w:val="1E293B"/>
           <w:sz w:val="16"/>
         </w:rPr>
-        <w:t>[4] B.-C. Björk and D. Solomon, "Open access versus subscription journals: a comparison of scientific impact," BMC Medicine, vol. 10, no. 1, p. 73, 2012, doi: 10.1186/1741-7015-10-73.</w:t>
+        <w:t xml:space="preserve">[4] K. D. Cobey, M. M. Lalu, B. Skidmore, N. Ahmadzai, A. Grudniewicz, and D. Moher, "What is a predatory journal? A scoping review," </w:t>
+      </w:r>
+      <w:r>
+        <w:rPr>
+          <w:rFonts w:ascii="Times New Roman" w:hAnsi="Times New Roman"/>
+          <w:i/>
+          <w:color w:val="1E293B"/>
+          <w:sz w:val="16"/>
+        </w:rPr>
+        <w:t>F1000Research</w:t>
+      </w:r>
+      <w:r>
+        <w:rPr>
+          <w:rFonts w:ascii="Times New Roman" w:hAnsi="Times New Roman"/>
+          <w:color w:val="1E293B"/>
+          <w:sz w:val="16"/>
+        </w:rPr>
+        <w:t>, vol. 7, p. 1001, 2018, doi: 10.12688/f1000research.15256.2.</w:t>
       </w:r>
     </w:p>
     <w:p>
@@ -12196,7 +12785,24 @@
           <w:color w:val="1E293B"/>
           <w:sz w:val="16"/>
         </w:rPr>
-        <w:t>[5] J. Bohannon, "Who's afraid of peer review?," Science, vol. 342, no. 6154, pp. 60–65, 2013, doi: 10.1126/science.342.6154.60.</w:t>
+        <w:t xml:space="preserve">[5] A. Grudniewicz, D. Moher, K. D. Cobey, et al., "Predatory journals: no definition, no defence," </w:t>
+      </w:r>
+      <w:r>
+        <w:rPr>
+          <w:rFonts w:ascii="Times New Roman" w:hAnsi="Times New Roman"/>
+          <w:i/>
+          <w:color w:val="1E293B"/>
+          <w:sz w:val="16"/>
+        </w:rPr>
+        <w:t>Nature</w:t>
+      </w:r>
+      <w:r>
+        <w:rPr>
+          <w:rFonts w:ascii="Times New Roman" w:hAnsi="Times New Roman"/>
+          <w:color w:val="1E293B"/>
+          <w:sz w:val="16"/>
+        </w:rPr>
+        <w:t>, vol. 576, no. 7786, pp. 210–212, 2019, doi: 10.1038/d41586-019-03759-y.</w:t>
       </w:r>
     </w:p>
     <w:p>
@@ -12211,7 +12817,24 @@
           <w:color w:val="1E293B"/>
           <w:sz w:val="16"/>
         </w:rPr>
-        <w:t>[6] K. D. Cobey, M. M. Lalu, B. Skidmore, N. Ahmadzai, A. Grudniewicz, and D. Moher, "What is a predatory journal? A scoping review," F1000Research, vol. 7, p. 1001, 2018, doi: 10.12688/f1000research.15256.2.</w:t>
+        <w:t xml:space="preserve">[6] D. Moher, L. Shamseer, K. D. Cobey, et al., "Stop this waste of people, animals and money," </w:t>
+      </w:r>
+      <w:r>
+        <w:rPr>
+          <w:rFonts w:ascii="Times New Roman" w:hAnsi="Times New Roman"/>
+          <w:i/>
+          <w:color w:val="1E293B"/>
+          <w:sz w:val="16"/>
+        </w:rPr>
+        <w:t>Nature</w:t>
+      </w:r>
+      <w:r>
+        <w:rPr>
+          <w:rFonts w:ascii="Times New Roman" w:hAnsi="Times New Roman"/>
+          <w:color w:val="1E293B"/>
+          <w:sz w:val="16"/>
+        </w:rPr>
+        <w:t>, vol. 549, no. 7670, pp. 23–25, 2017, doi: 10.1038/549023a.</w:t>
       </w:r>
     </w:p>
     <w:p>
@@ -12226,7 +12849,24 @@
           <w:color w:val="1E293B"/>
           <w:sz w:val="16"/>
         </w:rPr>
-        <w:t>[7] T. Vence, "Paper mills: the dark side of open access," The Scientist, vol. 36, no. 2, pp. 20–25, 2022.</w:t>
+        <w:t xml:space="preserve">[7] L.-X. Chen, S.-W. Su, C.-H. Liao, K.-S. Wong, and S.-M. Yuan, "An open automation system for predatory journal detection," </w:t>
+      </w:r>
+      <w:r>
+        <w:rPr>
+          <w:rFonts w:ascii="Times New Roman" w:hAnsi="Times New Roman"/>
+          <w:i/>
+          <w:color w:val="1E293B"/>
+          <w:sz w:val="16"/>
+        </w:rPr>
+        <w:t>Scientific Reports</w:t>
+      </w:r>
+      <w:r>
+        <w:rPr>
+          <w:rFonts w:ascii="Times New Roman" w:hAnsi="Times New Roman"/>
+          <w:color w:val="1E293B"/>
+          <w:sz w:val="16"/>
+        </w:rPr>
+        <w:t>, vol. 13, no. 1, p. 2976, 2023, doi: 10.1038/s41598-023-30176-z.</w:t>
       </w:r>
     </w:p>
     <w:p>
@@ -12241,7 +12881,24 @@
           <w:color w:val="1E293B"/>
           <w:sz w:val="16"/>
         </w:rPr>
-        <w:t>[8] D. Moher et al., "Stop this waste of people, animals and money," Nature, vol. 549, no. 7670, pp. 23–25, 2017, doi: 10.1038/549023a.</w:t>
+        <w:t xml:space="preserve">[8] J. A. Teixeira da Silva, "Variation in journal website characterization by an AI-driven 'predatory' journal detector," </w:t>
+      </w:r>
+      <w:r>
+        <w:rPr>
+          <w:rFonts w:ascii="Times New Roman" w:hAnsi="Times New Roman"/>
+          <w:i/>
+          <w:color w:val="1E293B"/>
+          <w:sz w:val="16"/>
+        </w:rPr>
+        <w:t>Expert Systems with Applications</w:t>
+      </w:r>
+      <w:r>
+        <w:rPr>
+          <w:rFonts w:ascii="Times New Roman" w:hAnsi="Times New Roman"/>
+          <w:color w:val="1E293B"/>
+          <w:sz w:val="16"/>
+        </w:rPr>
+        <w:t>, vol. 283, p. 127933, 2025, doi: 10.1016/j.eswa.2025.127933.</w:t>
       </w:r>
     </w:p>
     <w:p>
@@ -12256,7 +12913,24 @@
           <w:color w:val="1E293B"/>
           <w:sz w:val="16"/>
         </w:rPr>
-        <w:t>[9] V. Dadkhah and G. Bianciardi, "Ranking predatory journals: solve the problem on the reverse side!," Medical Oncology, vol. 33, no. 9, p. 100, 2016, doi: 10.1007/s12032-016-0816-7.</w:t>
+        <w:t xml:space="preserve">[9] D. Al-Moghrabi, S. A. Arqub, M. P. Maroulakos, N. Pandis, and P. S. Fleming, "Can ChatGPT identify predatory biomedical and dental journals? A cross-sectional content analysis," </w:t>
+      </w:r>
+      <w:r>
+        <w:rPr>
+          <w:rFonts w:ascii="Times New Roman" w:hAnsi="Times New Roman"/>
+          <w:i/>
+          <w:color w:val="1E293B"/>
+          <w:sz w:val="16"/>
+        </w:rPr>
+        <w:t>Journal of Dentistry</w:t>
+      </w:r>
+      <w:r>
+        <w:rPr>
+          <w:rFonts w:ascii="Times New Roman" w:hAnsi="Times New Roman"/>
+          <w:color w:val="1E293B"/>
+          <w:sz w:val="16"/>
+        </w:rPr>
+        <w:t>, vol. 142, p. 104840, 2024, doi: 10.1016/j.jdent.2024.104840.</w:t>
       </w:r>
     </w:p>
     <w:p>
@@ -12271,7 +12945,24 @@
           <w:color w:val="1E293B"/>
           <w:sz w:val="16"/>
         </w:rPr>
-        <w:t>[10] A. Strielkowski, "Predatory publishing: What can be done?," Learned Publishing, vol. 30, no. 3, pp. 255–258, 2017, doi: 10.1002/leap.1098.</w:t>
+        <w:t xml:space="preserve">[10] J. Wu, T. Liu, K. Mu, and L. Zhou, "Identification and causal analysis of predatory open access journals based on interpretable machine learning," </w:t>
+      </w:r>
+      <w:r>
+        <w:rPr>
+          <w:rFonts w:ascii="Times New Roman" w:hAnsi="Times New Roman"/>
+          <w:i/>
+          <w:color w:val="1E293B"/>
+          <w:sz w:val="16"/>
+        </w:rPr>
+        <w:t>Scientometrics</w:t>
+      </w:r>
+      <w:r>
+        <w:rPr>
+          <w:rFonts w:ascii="Times New Roman" w:hAnsi="Times New Roman"/>
+          <w:color w:val="1E293B"/>
+          <w:sz w:val="16"/>
+        </w:rPr>
+        <w:t>, vol. 129, pp. 3125–3148, 2024, doi: 10.1007/s11192-024-04969-6.</w:t>
       </w:r>
     </w:p>
     <w:p>
@@ -12286,7 +12977,24 @@
           <w:color w:val="1E293B"/>
           <w:sz w:val="16"/>
         </w:rPr>
-        <w:t>[11] M. S. Forero et al., "Negative effects of predatory journals on scientific research," Nature Human Behaviour, vol. 2, pp. 608–610, 2018, doi: 10.1038/s41562-018-0428-1.</w:t>
+        <w:t xml:space="preserve">[11] L. Shamseer, D. Moher, O. Maduekwe, et al., "Potential predatory and legitimate biomedical journals: can you tell the difference? A cross-sectional comparison," </w:t>
+      </w:r>
+      <w:r>
+        <w:rPr>
+          <w:rFonts w:ascii="Times New Roman" w:hAnsi="Times New Roman"/>
+          <w:i/>
+          <w:color w:val="1E293B"/>
+          <w:sz w:val="16"/>
+        </w:rPr>
+        <w:t>BMC Medicine</w:t>
+      </w:r>
+      <w:r>
+        <w:rPr>
+          <w:rFonts w:ascii="Times New Roman" w:hAnsi="Times New Roman"/>
+          <w:color w:val="1E293B"/>
+          <w:sz w:val="16"/>
+        </w:rPr>
+        <w:t>, vol. 15, no. 1, pp. 1–14, 2017, doi: 10.1186/s12916-017-0785-9.</w:t>
       </w:r>
     </w:p>
     <w:p>
@@ -12301,7 +13009,24 @@
           <w:color w:val="1E293B"/>
           <w:sz w:val="16"/>
         </w:rPr>
-        <w:t>[12] K. S. Sorooshian, "Automated identification of predatory journals based on publication velocity and website metadata," Accountability in Research, vol. 28, no. 5, pp. 312–326, 2021, doi: 10.1080/08989621.2020.1843422.</w:t>
+        <w:t xml:space="preserve">[12] F. Krawczyk and E. Kulczycki, "How do open access predatory journals operate in the era of artificial intelligence?," </w:t>
+      </w:r>
+      <w:r>
+        <w:rPr>
+          <w:rFonts w:ascii="Times New Roman" w:hAnsi="Times New Roman"/>
+          <w:i/>
+          <w:color w:val="1E293B"/>
+          <w:sz w:val="16"/>
+        </w:rPr>
+        <w:t>Journal of Informetrics</w:t>
+      </w:r>
+      <w:r>
+        <w:rPr>
+          <w:rFonts w:ascii="Times New Roman" w:hAnsi="Times New Roman"/>
+          <w:color w:val="1E293B"/>
+          <w:sz w:val="16"/>
+        </w:rPr>
+        <w:t>, vol. 17, no. 2, p. 101402, 2023, doi: 10.1016/j.joi.2023.101402.</w:t>
       </w:r>
     </w:p>
     <w:p>
@@ -12316,7 +13041,24 @@
           <w:color w:val="1E293B"/>
           <w:sz w:val="16"/>
         </w:rPr>
-        <w:t>[13] NCTU DCS Lab, "A multi-dimensional machine learning baseline for predatory journal detection," Scientific Reports, vol. 13, p. 4821, 2023, doi: 10.1038/s41598-023-31782-y.</w:t>
+        <w:t xml:space="preserve">[13] M. Kachuee, K. Karkkainen, V. Ordonez, and M. Sarrafzadeh, "Cost-aware feature acquisition for dynamic health risk prediction," </w:t>
+      </w:r>
+      <w:r>
+        <w:rPr>
+          <w:rFonts w:ascii="Times New Roman" w:hAnsi="Times New Roman"/>
+          <w:i/>
+          <w:color w:val="1E293B"/>
+          <w:sz w:val="16"/>
+        </w:rPr>
+        <w:t>IEEE Journal of Biomedical and Health Informatics</w:t>
+      </w:r>
+      <w:r>
+        <w:rPr>
+          <w:rFonts w:ascii="Times New Roman" w:hAnsi="Times New Roman"/>
+          <w:color w:val="1E293B"/>
+          <w:sz w:val="16"/>
+        </w:rPr>
+        <w:t>, vol. 23, no. 5, pp. 2056–2064, 2019, doi: 10.1109/JBHI.2018.2882772.</w:t>
       </w:r>
     </w:p>
     <w:p>
@@ -12331,7 +13073,24 @@
           <w:color w:val="1E293B"/>
           <w:sz w:val="16"/>
         </w:rPr>
-        <w:t>[14] T. Bano, R. Kumar, and P. Singh, "Automated detection of fraudulent scholarly websites via DOM tree structural analysis," IEEE Transactions on Knowledge and Data Engineering, vol. 35, no. 4, pp. 4120–4133, 2023, doi: 10.1109/TKDE.2021.3138858.</w:t>
+        <w:t xml:space="preserve">[14] Z. Xu, K. Q. Weinberger, and O. Chapelle, "Cost-sensitive tree of classifiers," in </w:t>
+      </w:r>
+      <w:r>
+        <w:rPr>
+          <w:rFonts w:ascii="Times New Roman" w:hAnsi="Times New Roman"/>
+          <w:i/>
+          <w:color w:val="1E293B"/>
+          <w:sz w:val="16"/>
+        </w:rPr>
+        <w:t>International Conference on Machine Learning (ICML)</w:t>
+      </w:r>
+      <w:r>
+        <w:rPr>
+          <w:rFonts w:ascii="Times New Roman" w:hAnsi="Times New Roman"/>
+          <w:color w:val="1E293B"/>
+          <w:sz w:val="16"/>
+        </w:rPr>
+        <w:t>, 2014, pp. 133–141.</w:t>
       </w:r>
     </w:p>
     <w:p>
@@ -12346,7 +13105,24 @@
           <w:color w:val="1E293B"/>
           <w:sz w:val="16"/>
         </w:rPr>
-        <w:t>[15] A. Severin and K. Low, "Predatory publishing: A guide for researchers," Learned Publishing, vol. 32, no. 3, pp. 281–289, 2019, doi: 10.1002/leap.1232.</w:t>
+        <w:t xml:space="preserve">[15] S. Teerapittayanon, B. McDanel, and H.-T. Kung, "BranchyNet: Fast inference via early exiting from deep neural networks," in </w:t>
+      </w:r>
+      <w:r>
+        <w:rPr>
+          <w:rFonts w:ascii="Times New Roman" w:hAnsi="Times New Roman"/>
+          <w:i/>
+          <w:color w:val="1E293B"/>
+          <w:sz w:val="16"/>
+        </w:rPr>
+        <w:t>2016 23rd International Conference on Pattern Recognition (ICPR)</w:t>
+      </w:r>
+      <w:r>
+        <w:rPr>
+          <w:rFonts w:ascii="Times New Roman" w:hAnsi="Times New Roman"/>
+          <w:color w:val="1E293B"/>
+          <w:sz w:val="16"/>
+        </w:rPr>
+        <w:t>, IEEE, 2016, pp. 2464–2469, doi: 10.1109/ICPR.2016.7900006.</w:t>
       </w:r>
     </w:p>
     <w:p>
@@ -12361,7 +13137,24 @@
           <w:color w:val="1E293B"/>
           <w:sz w:val="16"/>
         </w:rPr>
-        <w:t>[16] L. Shamseer et al., "Potential predatory and legitimate biomedical journals: can you tell the difference? A cross-sectional comparison," BMC Medicine, vol. 15, no. 1, pp. 1–14, 2017, doi: 10.1186/s12916-017-0785-9.</w:t>
+        <w:t xml:space="preserve">[16] W. Liu, P. Zhou, Z. Wang, Z. Zhao, H. Deng, and Q. Ju, "FastBERT: a self-distilling BERT with adaptive inference time," in </w:t>
+      </w:r>
+      <w:r>
+        <w:rPr>
+          <w:rFonts w:ascii="Times New Roman" w:hAnsi="Times New Roman"/>
+          <w:i/>
+          <w:color w:val="1E293B"/>
+          <w:sz w:val="16"/>
+        </w:rPr>
+        <w:t>Proceedings of the 58th Annual Meeting of the Association for Computational Linguistics (ACL)</w:t>
+      </w:r>
+      <w:r>
+        <w:rPr>
+          <w:rFonts w:ascii="Times New Roman" w:hAnsi="Times New Roman"/>
+          <w:color w:val="1E293B"/>
+          <w:sz w:val="16"/>
+        </w:rPr>
+        <w:t>, 2020, pp. 6036–6044, doi: 10.18653/v1/2020.acl-main.537.</w:t>
       </w:r>
     </w:p>
     <w:p>
@@ -12376,7 +13169,24 @@
           <w:color w:val="1E293B"/>
           <w:sz w:val="16"/>
         </w:rPr>
-        <w:t>[17] A. Grudniewicz, D. Moher, K. D. Cobey et al., "Consensus definition of predatory journals," Nature, vol. 576, pp. 210–212, 2019, doi: 10.1038/d41586-019-03759-y.</w:t>
+        <w:t xml:space="preserve">[17] C. Cortes, G. DeSalvo, and M. Mohri, "Learning with rejection," in </w:t>
+      </w:r>
+      <w:r>
+        <w:rPr>
+          <w:rFonts w:ascii="Times New Roman" w:hAnsi="Times New Roman"/>
+          <w:i/>
+          <w:color w:val="1E293B"/>
+          <w:sz w:val="16"/>
+        </w:rPr>
+        <w:t>International Conference on Algorithmic Learning Theory</w:t>
+      </w:r>
+      <w:r>
+        <w:rPr>
+          <w:rFonts w:ascii="Times New Roman" w:hAnsi="Times New Roman"/>
+          <w:color w:val="1E293B"/>
+          <w:sz w:val="16"/>
+        </w:rPr>
+        <w:t>, Springer, 2016, pp. 67–82, doi: 10.1007/978-3-319-46379-7_5.</w:t>
       </w:r>
     </w:p>
     <w:p>
@@ -12391,7 +13201,24 @@
           <w:color w:val="1E293B"/>
           <w:sz w:val="16"/>
         </w:rPr>
-        <w:t>[18] A. Severin, M. Strinzel, M. Egger, T. Barros, and P. R. Silva, "Discipline-specific characteristics of predatory publishing," Learned Publishing, vol. 34, no. 3, pp. 385–397, 2021, doi: 10.1002/leap.1379.</w:t>
+        <w:t xml:space="preserve">[18] Y. Geifman and R. El-Yaniv, "Selective classification for deep neural networks," in </w:t>
+      </w:r>
+      <w:r>
+        <w:rPr>
+          <w:rFonts w:ascii="Times New Roman" w:hAnsi="Times New Roman"/>
+          <w:i/>
+          <w:color w:val="1E293B"/>
+          <w:sz w:val="16"/>
+        </w:rPr>
+        <w:t>Advances in Neural Information Processing Systems (NeurIPS)</w:t>
+      </w:r>
+      <w:r>
+        <w:rPr>
+          <w:rFonts w:ascii="Times New Roman" w:hAnsi="Times New Roman"/>
+          <w:color w:val="1E293B"/>
+          <w:sz w:val="16"/>
+        </w:rPr>
+        <w:t>, vol. 30, 2017, pp. 4878–4887.</w:t>
       </w:r>
     </w:p>
     <w:p>
@@ -12406,7 +13233,24 @@
           <w:color w:val="1E293B"/>
           <w:sz w:val="16"/>
         </w:rPr>
-        <w:t>[19] F. Krawczyk and E. Kulczycki, "How do open access predatory journals operate in the era of artificial intelligence?," Journal of Informetrics, vol. 17, no. 2, p. 101402, 2023, doi: 10.1016/j.joi.2023.101402.</w:t>
+        <w:t xml:space="preserve">[19] C. Guo, G. Pleiss, Y. Sun, and K. Q. Weinberger, "On calibration of modern neural networks," in </w:t>
+      </w:r>
+      <w:r>
+        <w:rPr>
+          <w:rFonts w:ascii="Times New Roman" w:hAnsi="Times New Roman"/>
+          <w:i/>
+          <w:color w:val="1E293B"/>
+          <w:sz w:val="16"/>
+        </w:rPr>
+        <w:t>International Conference on Machine Learning (ICML)</w:t>
+      </w:r>
+      <w:r>
+        <w:rPr>
+          <w:rFonts w:ascii="Times New Roman" w:hAnsi="Times New Roman"/>
+          <w:color w:val="1E293B"/>
+          <w:sz w:val="16"/>
+        </w:rPr>
+        <w:t>, PMLR, 2017, pp. 1321–1330.</w:t>
       </w:r>
     </w:p>
     <w:p>
@@ -12421,142 +13265,24 @@
           <w:color w:val="1E293B"/>
           <w:sz w:val="16"/>
         </w:rPr>
-        <w:t>[20] M. Kachuee, K. Karkkainen, V. Ordonez, and M. Sarrafzadeh, "Cost-aware feature acquisition for dynamic health risk prediction," IEEE Journal of Biomedical and Health Informatics, vol. 23, no. 5, pp. 2056–2064, 2019, doi: 10.1109/JBHI.2019.2894165.</w:t>
+        <w:t xml:space="preserve">[20] J. Platt, "Probabilistic outputs for support vector machines and comparisons to regularized likelihood methods," </w:t>
       </w:r>
-    </w:p>
-    <w:p>
-      <w:pPr>
-        <w:spacing w:after="50"/>
-        <w:ind w:left="288" w:hanging="288"/>
-        <w:jc w:val="both"/>
-      </w:pPr>
+      <w:r>
+        <w:rPr>
+          <w:rFonts w:ascii="Times New Roman" w:hAnsi="Times New Roman"/>
+          <w:i/>
+          <w:color w:val="1E293B"/>
+          <w:sz w:val="16"/>
+        </w:rPr>
+        <w:t>Advances in Large Margin Classifiers</w:t>
+      </w:r>
       <w:r>
         <w:rPr>
           <w:rFonts w:ascii="Times New Roman" w:hAnsi="Times New Roman"/>
           <w:color w:val="1E293B"/>
           <w:sz w:val="16"/>
         </w:rPr>
-        <w:t>[21] Z. Xu, K. Q. Weinberger, and O. Chapelle, "Cost-sensitive tree of classifiers," in International Conference on Machine Learning (ICML), 2014, pp. 133–141.</w:t>
-      </w:r>
-    </w:p>
-    <w:p>
-      <w:pPr>
-        <w:spacing w:after="50"/>
-        <w:ind w:left="288" w:hanging="288"/>
-        <w:jc w:val="both"/>
-      </w:pPr>
-      <w:r>
-        <w:rPr>
-          <w:rFonts w:ascii="Times New Roman" w:hAnsi="Times New Roman"/>
-          <w:color w:val="1E293B"/>
-          <w:sz w:val="16"/>
-        </w:rPr>
-        <w:t>[22] S. Teerapittayanon, B. McDanel, and H.-T. Kung, "BranchyNet: Fast inference via early exiting from deep neural networks," in 2016 23rd International Conference on Pattern Recognition (ICPR), IEEE, 2016, pp. 2464–2469, doi: 10.1109/ICPR.2016.7900006.</w:t>
-      </w:r>
-    </w:p>
-    <w:p>
-      <w:pPr>
-        <w:spacing w:after="50"/>
-        <w:ind w:left="288" w:hanging="288"/>
-        <w:jc w:val="both"/>
-      </w:pPr>
-      <w:r>
-        <w:rPr>
-          <w:rFonts w:ascii="Times New Roman" w:hAnsi="Times New Roman"/>
-          <w:color w:val="1E293B"/>
-          <w:sz w:val="16"/>
-        </w:rPr>
-        <w:t>[23] W. Liu, P. Zhou, Z. Wang, Z. Zhao, H. Deng, and Q. Ju, "FastBERT: a self-distilling BERT with adaptive inference time," in Proceedings of the 58th Annual Meeting of the Association for Computational Linguistics (ACL), 2020, pp. 6036–6044, doi: 10.18653/v1/2020.acl-main.537.</w:t>
-      </w:r>
-    </w:p>
-    <w:p>
-      <w:pPr>
-        <w:spacing w:after="50"/>
-        <w:ind w:left="288" w:hanging="288"/>
-        <w:jc w:val="both"/>
-      </w:pPr>
-      <w:r>
-        <w:rPr>
-          <w:rFonts w:ascii="Times New Roman" w:hAnsi="Times New Roman"/>
-          <w:color w:val="1E293B"/>
-          <w:sz w:val="16"/>
-        </w:rPr>
-        <w:t>[24] C. Cortes, G. DeSalvo, and M. Mohri, "Learning with rejection," in International Conference on Algorithmic Learning Theory, Springer, 2016, pp. 67–82, doi: 10.1007/978-3-319-46379-7_5.</w:t>
-      </w:r>
-    </w:p>
-    <w:p>
-      <w:pPr>
-        <w:spacing w:after="50"/>
-        <w:ind w:left="288" w:hanging="288"/>
-        <w:jc w:val="both"/>
-      </w:pPr>
-      <w:r>
-        <w:rPr>
-          <w:rFonts w:ascii="Times New Roman" w:hAnsi="Times New Roman"/>
-          <w:color w:val="1E293B"/>
-          <w:sz w:val="16"/>
-        </w:rPr>
-        <w:t>[25] Y. Geifman and R. El-Yaniv, "Selective classification for deep neural networks," in Advances in Neural Information Processing Systems (NeurIPS), vol. 30, 2017, pp. 4878–4887.</w:t>
-      </w:r>
-    </w:p>
-    <w:p>
-      <w:pPr>
-        <w:spacing w:after="50"/>
-        <w:ind w:left="288" w:hanging="288"/>
-        <w:jc w:val="both"/>
-      </w:pPr>
-      <w:r>
-        <w:rPr>
-          <w:rFonts w:ascii="Times New Roman" w:hAnsi="Times New Roman"/>
-          <w:color w:val="1E293B"/>
-          <w:sz w:val="16"/>
-        </w:rPr>
-        <w:t>[26] C. Guo, G. Pleiss, Y. Sun, and K. Q. Weinberger, "On calibration of modern neural networks," in International Conference on Machine Learning (ICML), PMLR, 2017, pp. 1321–1330.</w:t>
-      </w:r>
-    </w:p>
-    <w:p>
-      <w:pPr>
-        <w:spacing w:after="50"/>
-        <w:ind w:left="288" w:hanging="288"/>
-        <w:jc w:val="both"/>
-      </w:pPr>
-      <w:r>
-        <w:rPr>
-          <w:rFonts w:ascii="Times New Roman" w:hAnsi="Times New Roman"/>
-          <w:color w:val="1E293B"/>
-          <w:sz w:val="16"/>
-        </w:rPr>
-        <w:t>[27] J. Platt, "Probabilistic outputs for support vector machines and comparisons to regularized likelihood methods," Advances in Large Margin Classifiers, vol. 10, no. 3, pp. 61–74, 1999.</w:t>
-      </w:r>
-    </w:p>
-    <w:p>
-      <w:pPr>
-        <w:spacing w:after="50"/>
-        <w:ind w:left="288" w:hanging="288"/>
-        <w:jc w:val="both"/>
-      </w:pPr>
-      <w:r>
-        <w:rPr>
-          <w:rFonts w:ascii="Times New Roman" w:hAnsi="Times New Roman"/>
-          <w:color w:val="1E293B"/>
-          <w:sz w:val="16"/>
-        </w:rPr>
-        <w:t>[28] Committee on Publication Ethics (COPE), DOAJ, OASPA, and WAME, "Principles of Transparency and Best Practice in Scholarly Publishing (4th Edition)," COPE Guidelines, 2022, doi: 10.24318/cope.2019.1.12.</w:t>
-      </w:r>
-    </w:p>
-    <w:p>
-      <w:pPr>
-        <w:spacing w:after="50"/>
-        <w:ind w:left="288" w:hanging="288"/>
-        <w:jc w:val="both"/>
-      </w:pPr>
-      <w:r>
-        <w:rPr>
-          <w:rFonts w:ascii="Times New Roman" w:hAnsi="Times New Roman"/>
-          <w:color w:val="1E293B"/>
-          <w:sz w:val="16"/>
-        </w:rPr>
-        <w:t>[29] G. W. Brier, "Verification of forecasts expressed in terms of probability," Monthly Weather Review, vol. 78, no. 1, pp. 1–3, 1950, doi: 10.1175/1520-0493(1950)078&lt;0001:VOFEIT&gt;2.0.CO;2.</w:t>
+        <w:t>, vol. 10, no. 3, pp. 61–74, 1999.</w:t>
       </w:r>
     </w:p>
     <w:sectPr>

</xml_diff>